<commit_message>
docs: add confirmed offer and automation flow
</commit_message>
<xml_diff>
--- a/campaigns/dazn-etoro-retention/DAZN-etoro-Germany-campaign-plan.docx
+++ b/campaigns/dazn-etoro-retention/DAZN-etoro-Germany-campaign-plan.docx
@@ -1651,6 +1651,248 @@
         <w:t>etoro Germany CopyTrader: https://www.etoro.com/de/copytrader/</w:t>
       </w:r>
     </w:p>
+    <w:p>
+      <w:pPr>
+        <w:pStyle w:val="Heading1"/>
+      </w:pPr>
+      <w:r>
+        <w:t>Final First Version Update</w:t>
+      </w:r>
+    </w:p>
+    <w:p>
+      <w:r>
+        <w:t>The offer structure is confirmed for this first version. DAZN remains the hero: a qualifying new German etoro client receives two months of free DAZN. Activation is a post-signup pop-up offering a choice of nine eligible stocks or ETFs for the €20 first-deposit airdrop. Retention is a 10% bonus on qualifying deposits each month for six months, capped at €500. The bonus is paid manually and calculated six months after the deposit period.</w:t>
+      </w:r>
+    </w:p>
+    <w:p>
+      <w:pPr>
+        <w:pStyle w:val="Heading2"/>
+      </w:pPr>
+      <w:r>
+        <w:t>Confirmed additional benefits and rules</w:t>
+      </w:r>
+    </w:p>
+    <w:p>
+      <w:pPr>
+        <w:pStyle w:val="ListBullet"/>
+      </w:pPr>
+      <w:r>
+        <w:t>A 50% trading-commission discount is added to the offer, subject to final terms.</w:t>
+      </w:r>
+    </w:p>
+    <w:p>
+      <w:pPr>
+        <w:pStyle w:val="ListBullet"/>
+      </w:pPr>
+      <w:r>
+        <w:t>A zero-commission ETF is part of the pitch, subject to product and legal approval.</w:t>
+      </w:r>
+    </w:p>
+    <w:p>
+      <w:pPr>
+        <w:pStyle w:val="ListBullet"/>
+      </w:pPr>
+      <w:r>
+        <w:t>Exclusive benefits are for users who arrive by 30 September.</w:t>
+      </w:r>
+    </w:p>
+    <w:p>
+      <w:pPr>
+        <w:pStyle w:val="ListBullet"/>
+      </w:pPr>
+      <w:r>
+        <w:t>Do not mention crypto or CFD in this campaign.</w:t>
+      </w:r>
+    </w:p>
+    <w:p>
+      <w:pPr>
+        <w:pStyle w:val="ListBullet"/>
+      </w:pPr>
+      <w:r>
+        <w:t>Use football language and a native sport-fan experience rather than a complex trading-platform tone.</w:t>
+      </w:r>
+    </w:p>
+    <w:p>
+      <w:pPr>
+        <w:pStyle w:val="ListBullet"/>
+      </w:pPr>
+      <w:r>
+        <w:t>Surface familiar German stocks, ETFs and sport or football-linked names without making personalised recommendations.</w:t>
+      </w:r>
+    </w:p>
+    <w:p>
+      <w:pPr>
+        <w:pStyle w:val="Heading2"/>
+      </w:pPr>
+      <w:r>
+        <w:t>Current flow without automation</w:t>
+      </w:r>
+    </w:p>
+    <w:p>
+      <w:pPr>
+        <w:pStyle w:val="ListNumber"/>
+      </w:pPr>
+      <w:r>
+        <w:t>Users register and immediately receive a pop-up with the airdrop choice.</w:t>
+      </w:r>
+    </w:p>
+    <w:p>
+      <w:pPr>
+        <w:pStyle w:val="ListNumber"/>
+      </w:pPr>
+      <w:r>
+        <w:t>After they reach V3 status and deposit, they receive the selected airdrop.</w:t>
+      </w:r>
+    </w:p>
+    <w:p>
+      <w:pPr>
+        <w:pStyle w:val="Heading2"/>
+      </w:pPr>
+      <w:r>
+        <w:t>Proposed automation flow</w:t>
+      </w:r>
+    </w:p>
+    <w:p>
+      <w:pPr>
+        <w:pStyle w:val="ListNumber"/>
+      </w:pPr>
+      <w:r>
+        <w:t>DAZN markets the offer to its users.</w:t>
+      </w:r>
+    </w:p>
+    <w:p>
+      <w:pPr>
+        <w:pStyle w:val="ListNumber"/>
+      </w:pPr>
+      <w:r>
+        <w:t>The user arrives through the DAZN partnership and signs up to etoro.</w:t>
+      </w:r>
+    </w:p>
+    <w:p>
+      <w:pPr>
+        <w:pStyle w:val="ListNumber"/>
+      </w:pPr>
+      <w:r>
+        <w:t>The post-signup pop-up presents the €20 airdrop choice from nine eligible stocks or ETFs.</w:t>
+      </w:r>
+    </w:p>
+    <w:p>
+      <w:pPr>
+        <w:pStyle w:val="ListNumber"/>
+      </w:pPr>
+      <w:r>
+        <w:t>The user reaches V3 and deposits; the selected airdrop is granted.</w:t>
+      </w:r>
+    </w:p>
+    <w:p>
+      <w:pPr>
+        <w:pStyle w:val="ListNumber"/>
+      </w:pPr>
+      <w:r>
+        <w:t>A triggered email confirms the DAZN benefits and introduces the retention programme.</w:t>
+      </w:r>
+    </w:p>
+    <w:p>
+      <w:pPr>
+        <w:pStyle w:val="ListNumber"/>
+      </w:pPr>
+      <w:r>
+        <w:t>The email encourages a monthly deposit of €100 or more into an eligible zero-commission ETF, using recurring investment as a set-and-forget habit.</w:t>
+      </w:r>
+    </w:p>
+    <w:p>
+      <w:pPr>
+        <w:pStyle w:val="ListNumber"/>
+      </w:pPr>
+      <w:r>
+        <w:t>Monthly reminders track progress through the six-month period using football language and exclusive-benefit framing.</w:t>
+      </w:r>
+    </w:p>
+    <w:p>
+      <w:pPr>
+        <w:pStyle w:val="ListNumber"/>
+      </w:pPr>
+      <w:r>
+        <w:t>Six months after the qualifying deposit period, the 10% bonus is calculated and paid manually, subject to final terms.</w:t>
+      </w:r>
+    </w:p>
+    <w:p>
+      <w:pPr>
+        <w:pStyle w:val="Heading2"/>
+      </w:pPr>
+      <w:r>
+        <w:t>Audience test and workplan</w:t>
+      </w:r>
+    </w:p>
+    <w:p>
+      <w:pPr>
+        <w:pStyle w:val="ListBullet"/>
+      </w:pPr>
+      <w:r>
+        <w:t>Test freemium users against churned users with a defined control group.</w:t>
+      </w:r>
+    </w:p>
+    <w:p>
+      <w:pPr>
+        <w:pStyle w:val="ListBullet"/>
+      </w:pPr>
+      <w:r>
+        <w:t>Product panel: Dror, in progress; ready draft targeted for early next week.</w:t>
+      </w:r>
+    </w:p>
+    <w:p>
+      <w:pPr>
+        <w:pStyle w:val="ListBullet"/>
+      </w:pPr>
+      <w:r>
+        <w:t>Design: engaged Sunday to build from the panel and creative.</w:t>
+      </w:r>
+    </w:p>
+    <w:p>
+      <w:pPr>
+        <w:pStyle w:val="ListBullet"/>
+      </w:pPr>
+      <w:r>
+        <w:t>Launch email: Shiloh, Ben and David; include DAZN, 50% commission discount, up to €500 over six months, football language, 30 September deadline, and no crypto or CFD references.</w:t>
+      </w:r>
+    </w:p>
+    <w:p>
+      <w:pPr>
+        <w:pStyle w:val="ListBullet"/>
+      </w:pPr>
+      <w:r>
+        <w:t>Offer and legal: Ofer to close DAZN terms, German bonus approval, and tax treatment of the €20 airdrop.</w:t>
+      </w:r>
+    </w:p>
+    <w:p>
+      <w:pPr>
+        <w:pStyle w:val="ListBullet"/>
+      </w:pPr>
+      <w:r>
+        <w:t>Localisation: define Germany versus Spain differences before panel and email finalisation.</w:t>
+      </w:r>
+    </w:p>
+    <w:p>
+      <w:pPr>
+        <w:pStyle w:val="ListBullet"/>
+      </w:pPr>
+      <w:r>
+        <w:t>Measurement: set up the freemium versus churned A/B test before launch.</w:t>
+      </w:r>
+    </w:p>
+    <w:p>
+      <w:pPr>
+        <w:pStyle w:val="Heading2"/>
+      </w:pPr>
+      <w:r>
+        <w:t>Translated automation message</w:t>
+      </w:r>
+    </w:p>
+    <w:p>
+      <w:r>
+        <w:t>Because you arrived through DAZN, you receive special benefits. Invest €100 or more per month in eligible zero-commission ETFs through recurring investment, using a set-and-forget approach, and receive a bonus equal to 10% of your qualifying deposits after six months. Final wording, qualifying rules and German approval are required.</w:t>
+      </w:r>
+    </w:p>
     <w:sectPr>
       <w:pgSz w:w="12240" w:h="15840"/>
       <w:pgMar w:top="1080" w:right="1224" w:bottom="1080" w:left="1224" w:header="720" w:footer="720" w:gutter="0"/>

</xml_diff>